<commit_message>
Update slides, handout, and landing page for revised session flow
New demo, sample recipe and try-it slides, revised Level up and
Trust slides, updated agent loop picture, new outline order, and
the Keep it safe note aligned with WashU tool guidance.

Co-Authored-By: Claude Sonnet 5 <noreply@anthropic.com>
Claude-Session: https://claude.ai/code/session_01J3LVtsuP7euCp6vPfBwsk2
</commit_message>
<xml_diff>
--- a/handouts/Write Your Recipe Handout.docx
+++ b/handouts/Write Your Recipe Handout.docx
@@ -1240,7 +1240,26 @@
           <w:sz w:val="18"/>
           <w:szCs w:val="18"/>
         </w:rPr>
-        <w:t>Use a sanitized or made-up example. Please do not use student records, health information, passwords, or confidential research data. Save your recipe: you will turn it into a reusable assistant in the next block.</w:t>
+        <w:t xml:space="preserve">Check what data you can share with the tool you are using. WashU lists which tools are approved for FERPA data and for PHI at </w:t>
+      </w:r>
+      <w:hyperlink r:id="rId7" w:history="1">
+        <w:r>
+          <w:rPr>
+            <w:sz w:val="18"/>
+            <w:szCs w:val="18"/>
+            <w:color w:val="0563C1"/>
+            <w:u w:val="single"/>
+          </w:rPr>
+          <w:t xml:space="preserve">ai.washu.edu/tools</w:t>
+        </w:r>
+      </w:hyperlink>
+      <w:r>
+        <w:rPr>
+          <w:color w:val="333333"/>
+          <w:sz w:val="18"/>
+          <w:szCs w:val="18"/>
+        </w:rPr>
+        <w:t xml:space="preserve">. Not sure? Use a sanitized or made-up example. Never put passwords in an AI tool. Save your recipe: you will turn it into a reusable assistant in the next block.</w:t>
       </w:r>
     </w:p>
     <w:sectPr>

</xml_diff>